<commit_message>
Ammo pack model pickup
</commit_message>
<xml_diff>
--- a/Sprawozdania/Założenia projektowe - Oskar Drusko.docx
+++ b/Sprawozdania/Założenia projektowe - Oskar Drusko.docx
@@ -269,17 +269,15 @@
         </w:rPr>
         <w:t xml:space="preserve">Visual Studio </w:t>
       </w:r>
-      <w:proofErr w:type="spellStart"/>
-      <w:r>
-        <w:rPr>
-          <w:rFonts w:eastAsia="Times New Roman" w:cstheme="minorHAnsi"/>
-          <w:sz w:val="24"/>
-          <w:szCs w:val="24"/>
-          <w:lang w:eastAsia="pl-PL"/>
-        </w:rPr>
-        <w:t>Code</w:t>
-      </w:r>
-      <w:proofErr w:type="spellEnd"/>
+      <w:r>
+        <w:rPr>
+          <w:rFonts w:eastAsia="Times New Roman" w:cstheme="minorHAnsi"/>
+          <w:sz w:val="24"/>
+          <w:szCs w:val="24"/>
+          <w:lang w:eastAsia="pl-PL"/>
+        </w:rPr>
+        <w:t>2026</w:t>
+      </w:r>
     </w:p>
     <w:p>
       <w:pPr>
@@ -810,7 +808,33 @@
           <w:sz w:val="24"/>
           <w:szCs w:val="24"/>
         </w:rPr>
-        <w:t>:  wymagane będzie przechowywanie danych takich jak: obrażenia, szybkostrzelność, ilość amunicji.</w:t>
+        <w:t xml:space="preserve">:  wymagane będzie przechowywanie danych takich jak: obrażenia, szybkostrzelność, ilość </w:t>
+      </w:r>
+      <w:proofErr w:type="spellStart"/>
+      <w:r>
+        <w:rPr>
+          <w:rFonts w:cstheme="minorHAnsi"/>
+          <w:sz w:val="24"/>
+          <w:szCs w:val="24"/>
+        </w:rPr>
+        <w:t>amunicji</w:t>
+      </w:r>
+      <w:r>
+        <w:rPr>
+          <w:rFonts w:cstheme="minorHAnsi"/>
+          <w:sz w:val="24"/>
+          <w:szCs w:val="24"/>
+        </w:rPr>
+        <w:t>,zasięg</w:t>
+      </w:r>
+      <w:proofErr w:type="spellEnd"/>
+      <w:r>
+        <w:rPr>
+          <w:rFonts w:cstheme="minorHAnsi"/>
+          <w:sz w:val="24"/>
+          <w:szCs w:val="24"/>
+        </w:rPr>
+        <w:t>.</w:t>
       </w:r>
     </w:p>
     <w:p>
@@ -854,6 +878,14 @@
         </w:rPr>
         <w:t>,rakietnica,laserowa</w:t>
       </w:r>
+      <w:r>
+        <w:rPr>
+          <w:rFonts w:cstheme="minorHAnsi"/>
+          <w:sz w:val="24"/>
+          <w:szCs w:val="24"/>
+        </w:rPr>
+        <w:t>,pm</w:t>
+      </w:r>
       <w:proofErr w:type="spellEnd"/>
       <w:r>
         <w:rPr>
@@ -862,42 +894,6 @@
           <w:szCs w:val="24"/>
         </w:rPr>
         <w:t>)</w:t>
-      </w:r>
-    </w:p>
-    <w:p>
-      <w:pPr>
-        <w:tabs>
-          <w:tab w:val="left" w:pos="1635"/>
-        </w:tabs>
-        <w:rPr>
-          <w:rFonts w:cstheme="minorHAnsi"/>
-          <w:sz w:val="24"/>
-          <w:szCs w:val="24"/>
-        </w:rPr>
-      </w:pPr>
-      <w:r>
-        <w:rPr>
-          <w:rFonts w:cstheme="minorHAnsi"/>
-          <w:sz w:val="24"/>
-          <w:szCs w:val="24"/>
-        </w:rPr>
-        <w:t>- Różne bronie będą miały różne parametry (</w:t>
-      </w:r>
-      <w:r>
-        <w:rPr>
-          <w:rFonts w:cstheme="minorHAnsi"/>
-          <w:sz w:val="24"/>
-          <w:szCs w:val="24"/>
-        </w:rPr>
-        <w:t xml:space="preserve">np. </w:t>
-      </w:r>
-      <w:r>
-        <w:rPr>
-          <w:rFonts w:cstheme="minorHAnsi"/>
-          <w:sz w:val="24"/>
-          <w:szCs w:val="24"/>
-        </w:rPr>
-        <w:t>obrażenia, szybkostrzelność, zasięg)</w:t>
       </w:r>
     </w:p>
     <w:p>
@@ -1830,6 +1826,7 @@
           <w:sz w:val="24"/>
           <w:szCs w:val="24"/>
         </w:rPr>
+        <w:lastRenderedPageBreak/>
         <w:t>Interfejs pokazujący:</w:t>
       </w:r>
     </w:p>
@@ -2343,6 +2340,7 @@
         <w:t xml:space="preserve">liczba przeciwników rośnie </w:t>
       </w:r>
     </w:p>
+    <w:p/>
     <w:p/>
     <w:p/>
     <w:p/>
@@ -5204,6 +5202,7 @@
   <w:style w:type="character" w:default="1" w:styleId="Domylnaczcionkaakapitu">
     <w:name w:val="Default Paragraph Font"/>
     <w:uiPriority w:val="1"/>
+    <w:semiHidden/>
     <w:unhideWhenUsed/>
   </w:style>
   <w:style w:type="table" w:default="1" w:styleId="Standardowy">
@@ -5605,6 +5604,30 @@
 </file>
 
 <file path=customXml/item1.xml><?xml version="1.0" encoding="utf-8"?>
+<b:Sources xmlns:b="http://schemas.openxmlformats.org/officeDocument/2006/bibliography" xmlns="http://schemas.openxmlformats.org/officeDocument/2006/bibliography" SelectedStyle="\APASixthEditionOfficeOnline.xsl" StyleName="APA" Version="6"/>
+</file>
+
+<file path=customXml/item2.xml><?xml version="1.0" encoding="utf-8"?>
+<p:properties xmlns:p="http://schemas.microsoft.com/office/2006/metadata/properties" xmlns:xsi="http://www.w3.org/2001/XMLSchema-instance" xmlns:pc="http://schemas.microsoft.com/office/infopath/2007/PartnerControls">
+  <documentManagement>
+    <lcf76f155ced4ddcb4097134ff3c332f xmlns="6b679841-6ae5-432e-95c4-4f74422ab886">
+      <Terms xmlns="http://schemas.microsoft.com/office/infopath/2007/PartnerControls"/>
+    </lcf76f155ced4ddcb4097134ff3c332f>
+    <TaxCatchAll xmlns="8cdbc9f3-76a3-47c3-b033-4de1b2bad10f" xsi:nil="true"/>
+  </documentManagement>
+</p:properties>
+</file>
+
+<file path=customXml/item3.xml><?xml version="1.0" encoding="utf-8"?>
+<?mso-contentType ?>
+<FormTemplates xmlns="http://schemas.microsoft.com/sharepoint/v3/contenttype/forms">
+  <Display>DocumentLibraryForm</Display>
+  <Edit>DocumentLibraryForm</Edit>
+  <New>DocumentLibraryForm</New>
+</FormTemplates>
+</file>
+
+<file path=customXml/item4.xml><?xml version="1.0" encoding="utf-8"?>
 <ct:contentTypeSchema xmlns:ct="http://schemas.microsoft.com/office/2006/metadata/contentType" xmlns:ma="http://schemas.microsoft.com/office/2006/metadata/properties/metaAttributes" ct:_="" ma:_="" ma:contentTypeName="Dokument" ma:contentTypeID="0x01010053DD3245FC8923409033E3DEAFD72368" ma:contentTypeVersion="10" ma:contentTypeDescription="Utwórz nowy dokument." ma:contentTypeScope="" ma:versionID="efd3b5387fe82e9be5b3f205bc21d5a0">
   <xsd:schema xmlns:xsd="http://www.w3.org/2001/XMLSchema" xmlns:xs="http://www.w3.org/2001/XMLSchema" xmlns:p="http://schemas.microsoft.com/office/2006/metadata/properties" xmlns:ns2="6b679841-6ae5-432e-95c4-4f74422ab886" xmlns:ns3="8cdbc9f3-76a3-47c3-b033-4de1b2bad10f" targetNamespace="http://schemas.microsoft.com/office/2006/metadata/properties" ma:root="true" ma:fieldsID="8c331950a838325528a3301760a85666" ns2:_="" ns3:_="">
     <xsd:import namespace="6b679841-6ae5-432e-95c4-4f74422ab886"/>
@@ -5793,31 +5816,34 @@
 </ct:contentTypeSchema>
 </file>
 
-<file path=customXml/item2.xml><?xml version="1.0" encoding="utf-8"?>
-<b:Sources xmlns:b="http://schemas.openxmlformats.org/officeDocument/2006/bibliography" xmlns="http://schemas.openxmlformats.org/officeDocument/2006/bibliography" SelectedStyle="\APASixthEditionOfficeOnline.xsl" StyleName="APA" Version="6"/>
+<file path=customXml/itemProps1.xml><?xml version="1.0" encoding="utf-8"?>
+<ds:datastoreItem xmlns:ds="http://schemas.openxmlformats.org/officeDocument/2006/customXml" ds:itemID="{5318A40A-A405-48B2-8E22-48B4F9BA3E92}">
+  <ds:schemaRefs>
+    <ds:schemaRef ds:uri="http://schemas.openxmlformats.org/officeDocument/2006/bibliography"/>
+  </ds:schemaRefs>
+</ds:datastoreItem>
 </file>
 
-<file path=customXml/item3.xml><?xml version="1.0" encoding="utf-8"?>
-<p:properties xmlns:p="http://schemas.microsoft.com/office/2006/metadata/properties" xmlns:xsi="http://www.w3.org/2001/XMLSchema-instance" xmlns:pc="http://schemas.microsoft.com/office/infopath/2007/PartnerControls">
-  <documentManagement>
-    <lcf76f155ced4ddcb4097134ff3c332f xmlns="6b679841-6ae5-432e-95c4-4f74422ab886">
-      <Terms xmlns="http://schemas.microsoft.com/office/infopath/2007/PartnerControls"/>
-    </lcf76f155ced4ddcb4097134ff3c332f>
-    <TaxCatchAll xmlns="8cdbc9f3-76a3-47c3-b033-4de1b2bad10f" xsi:nil="true"/>
-  </documentManagement>
-</p:properties>
+<file path=customXml/itemProps2.xml><?xml version="1.0" encoding="utf-8"?>
+<ds:datastoreItem xmlns:ds="http://schemas.openxmlformats.org/officeDocument/2006/customXml" ds:itemID="{DF1AB5FC-4C00-4B95-915D-4964D082F799}">
+  <ds:schemaRefs>
+    <ds:schemaRef ds:uri="http://schemas.microsoft.com/office/2006/metadata/properties"/>
+    <ds:schemaRef ds:uri="http://schemas.microsoft.com/office/infopath/2007/PartnerControls"/>
+    <ds:schemaRef ds:uri="6b679841-6ae5-432e-95c4-4f74422ab886"/>
+    <ds:schemaRef ds:uri="8cdbc9f3-76a3-47c3-b033-4de1b2bad10f"/>
+  </ds:schemaRefs>
+</ds:datastoreItem>
 </file>
 
-<file path=customXml/item4.xml><?xml version="1.0" encoding="utf-8"?>
-<?mso-contentType ?>
-<FormTemplates xmlns="http://schemas.microsoft.com/sharepoint/v3/contenttype/forms">
-  <Display>DocumentLibraryForm</Display>
-  <Edit>DocumentLibraryForm</Edit>
-  <New>DocumentLibraryForm</New>
-</FormTemplates>
+<file path=customXml/itemProps3.xml><?xml version="1.0" encoding="utf-8"?>
+<ds:datastoreItem xmlns:ds="http://schemas.openxmlformats.org/officeDocument/2006/customXml" ds:itemID="{9D25A9B1-3121-495B-8B4B-3D20C3EBF5F5}">
+  <ds:schemaRefs>
+    <ds:schemaRef ds:uri="http://schemas.microsoft.com/sharepoint/v3/contenttype/forms"/>
+  </ds:schemaRefs>
+</ds:datastoreItem>
 </file>
 
-<file path=customXml/itemProps1.xml><?xml version="1.0" encoding="utf-8"?>
+<file path=customXml/itemProps4.xml><?xml version="1.0" encoding="utf-8"?>
 <ds:datastoreItem xmlns:ds="http://schemas.openxmlformats.org/officeDocument/2006/customXml" ds:itemID="{0E89473B-3C6E-489B-839C-147DD57CF085}">
   <ds:schemaRefs>
     <ds:schemaRef ds:uri="http://schemas.microsoft.com/office/2006/metadata/contentType"/>
@@ -5834,31 +5860,4 @@
     <ds:schemaRef ds:uri="http://schemas.microsoft.com/internal/obd"/>
   </ds:schemaRefs>
 </ds:datastoreItem>
-</file>
-
-<file path=customXml/itemProps2.xml><?xml version="1.0" encoding="utf-8"?>
-<ds:datastoreItem xmlns:ds="http://schemas.openxmlformats.org/officeDocument/2006/customXml" ds:itemID="{5318A40A-A405-48B2-8E22-48B4F9BA3E92}">
-  <ds:schemaRefs>
-    <ds:schemaRef ds:uri="http://schemas.openxmlformats.org/officeDocument/2006/bibliography"/>
-  </ds:schemaRefs>
-</ds:datastoreItem>
-</file>
-
-<file path=customXml/itemProps3.xml><?xml version="1.0" encoding="utf-8"?>
-<ds:datastoreItem xmlns:ds="http://schemas.openxmlformats.org/officeDocument/2006/customXml" ds:itemID="{DF1AB5FC-4C00-4B95-915D-4964D082F799}">
-  <ds:schemaRefs>
-    <ds:schemaRef ds:uri="http://schemas.microsoft.com/office/2006/metadata/properties"/>
-    <ds:schemaRef ds:uri="http://schemas.microsoft.com/office/infopath/2007/PartnerControls"/>
-    <ds:schemaRef ds:uri="6b679841-6ae5-432e-95c4-4f74422ab886"/>
-    <ds:schemaRef ds:uri="8cdbc9f3-76a3-47c3-b033-4de1b2bad10f"/>
-  </ds:schemaRefs>
-</ds:datastoreItem>
-</file>
-
-<file path=customXml/itemProps4.xml><?xml version="1.0" encoding="utf-8"?>
-<ds:datastoreItem xmlns:ds="http://schemas.openxmlformats.org/officeDocument/2006/customXml" ds:itemID="{9D25A9B1-3121-495B-8B4B-3D20C3EBF5F5}">
-  <ds:schemaRefs>
-    <ds:schemaRef ds:uri="http://schemas.microsoft.com/sharepoint/v3/contenttype/forms"/>
-  </ds:schemaRefs>
-</ds:datastoreItem>
 </file>
</xml_diff>